<commit_message>
Résumé refresh, Gmail contact, static homepage content
- résumé (HTML, PDF, Word): personal Gmail; plainer TRACTION and TRACI
  bullets; Karst moved out of the Tire Rack entry; AI-first workflow
  bullet; skills retargeted to UX/front-end (TypeScript, FastAPI,
  accessibility, AI & cloud) and IT-admin tools trimmed
- site contact email -> gabrielharlan2@gmail.com
- Karst links point at karst.web.app (spelunk-a-dunk redirects there)
- prerender: write a static summary of the homepage into #root so
  no-JS readers (AI screeners, link fetchers) see the real content;
  hidden for JS visitors and replaced when React mounts

Co-Authored-By: Claude Opus 5.5 <noreply@anthropic.com>
</commit_message>
<xml_diff>
--- a/public/Gabriel-Harlan-Resume.docx
+++ b/public/Gabriel-Harlan-Resume.docx
@@ -99,7 +99,7 @@
                 <w:color w:val="211B14"/>
                 <w:sz w:val="16"/>
               </w:rPr>
-              <w:t>gbharlan@iu.edu</w:t>
+              <w:t>gabrielharlan2@gmail.com</w:t>
             </w:r>
           </w:p>
           <w:p>
@@ -522,7 +522,7 @@
                 <w:color w:val="5A4F41"/>
                 <w:sz w:val="18"/>
               </w:rPr>
-              <w:t>Designed and prototyped TRACTION, a sales-enablement rep console — an engine scores customers on LTV × churn × signal recency into a suppression-filtered, frequency-capped daily queue, pairing each lead with a why-now reason, cross-channel history, and an AI-matched cart.</w:t>
+              <w:t>Designed and prototyped TRACTION, an AI-assisted sales console for retention reps — a ranked daily call queue that pairs each lead with a why-now reason, cross-channel history, and an AI-matched cart; turned another team's loose ideas into a mockup presented to senior leadership.</w:t>
             </w:r>
           </w:p>
           <w:p>
@@ -548,7 +548,7 @@
                 <w:color w:val="5A4F41"/>
                 <w:sz w:val="18"/>
               </w:rPr>
-              <w:t>Built and shipped a production SMS gateway (Python / FastAPI on Cloud Run) that lets customers text Tire Rack's TRACI AI agent — webhook → async worker → agent → Twilio SMS, with Redis/SQS, STOP/HELP compliance, 90 tests, and keyless CI/CD; solved the web-only vehicle picker with a numbered YMMV drill-down that auto-supplies factory tire size.</w:t>
+              <w:t>Designed, built, and shipped solo a production SMS gateway (Python / FastAPI on Cloud Run + Twilio) that lets customers text Tire Rack's TRACI AI agent — async workers, Redis sessions, STOP/HELP compliance, 90 tests, and keyless CI/CD; replaced the web-only vehicle picker with a numbered text drill-down that auto-fills factory tire size.</w:t>
             </w:r>
           </w:p>
           <w:p>
@@ -574,7 +574,7 @@
                 <w:color w:val="5A4F41"/>
                 <w:sz w:val="18"/>
               </w:rPr>
-              <w:t>Built Karst, a Next.js + Firebase caving field guide (web + Android) with a privacy-first map — shipped fast with AI-assisted development.</w:t>
+              <w:t>Worked AI-first with Claude Code as a pair programmer, shipping a production service and a leadership-ready prototype in ten weeks.</w:t>
             </w:r>
           </w:p>
           <w:p>
@@ -873,7 +873,7 @@
                 <w:color w:val="5A4F41"/>
                 <w:sz w:val="17"/>
               </w:rPr>
-              <w:t>JavaScript, Python, PHP, MySQL</w:t>
+              <w:t>JavaScript, TypeScript, Python, PHP, MySQL</w:t>
             </w:r>
           </w:p>
           <w:p>
@@ -903,7 +903,7 @@
                 <w:color w:val="5A4F41"/>
                 <w:sz w:val="17"/>
               </w:rPr>
-              <w:t>React / Next.js, HTML, CSS, Firebase, Git</w:t>
+              <w:t>React / Next.js, HTML, CSS, FastAPI, Firebase, Git</w:t>
             </w:r>
           </w:p>
           <w:p>
@@ -933,7 +933,7 @@
                 <w:color w:val="5A4F41"/>
                 <w:sz w:val="17"/>
               </w:rPr>
-              <w:t>Figma, UX &amp; HCI Design, Web Design, Tableau</w:t>
+              <w:t>Figma, UX &amp; HCI Design, Accessibility, Web Design, Tableau</w:t>
             </w:r>
           </w:p>
           <w:p>
@@ -948,7 +948,7 @@
                 <w:color w:val="211B14"/>
                 <w:sz w:val="15"/>
               </w:rPr>
-              <w:t>Operating Systems</w:t>
+              <w:t>AI &amp; Cloud</w:t>
             </w:r>
           </w:p>
           <w:p>
@@ -963,7 +963,7 @@
                 <w:color w:val="5A4F41"/>
                 <w:sz w:val="17"/>
               </w:rPr>
-              <w:t>Linux, macOS, Windows 10/11, Windows Server</w:t>
+              <w:t>Claude Code (AI-assisted dev), Google Cloud Run, Twilio, Redis</w:t>
             </w:r>
           </w:p>
           <w:p>
@@ -993,7 +993,7 @@
                 <w:color w:val="5A4F41"/>
                 <w:sz w:val="17"/>
               </w:rPr>
-              <w:t>Active Directory, Claude Code, Office365, VirtualBox, VMware, VS Code, WSL</w:t>
+              <w:t>VS Code, WSL, Linux, macOS, Windows</w:t>
             </w:r>
           </w:p>
           <w:p>
@@ -1255,7 +1255,7 @@
                 <w:color w:val="5A4F41"/>
                 <w:sz w:val="17"/>
               </w:rPr>
-              <w:t xml:space="preserve"> — Next.js + Firebase caving field guide (web + Android)</w:t>
+              <w:t xml:space="preserve"> — privacy-first caving field guide, live on web + Android (Next.js + Firebase)</w:t>
             </w:r>
           </w:p>
           <w:p>

</xml_diff>